<commit_message>
One Practical ML Question
</commit_message>
<xml_diff>
--- a/docs/Task4_Error_Analysis.docx
+++ b/docs/Task4_Error_Analysis.docx
@@ -818,7 +818,7 @@
               <w:rPr>
                 <w:sz w:val="17"/>
               </w:rPr>
-              <w:t>one split, one homophone (غ / ع), one split, one attached preposition</w:t>
+              <w:t>two splits and an attached preposition, plus one real misrecognition</w:t>
             </w:r>
           </w:p>
         </w:tc>
@@ -992,7 +992,7 @@
                 <w:b w:val="0"/>
                 <w:sz w:val="18"/>
               </w:rPr>
-              <w:t>87</w:t>
+              <w:t>88</w:t>
             </w:r>
           </w:p>
         </w:tc>
@@ -1011,7 +1011,7 @@
                 <w:b w:val="0"/>
                 <w:sz w:val="18"/>
               </w:rPr>
-              <w:t>55.8%</w:t>
+              <w:t>56.4%</w:t>
             </w:r>
           </w:p>
         </w:tc>
@@ -1030,7 +1030,7 @@
                 <w:b w:val="0"/>
                 <w:sz w:val="18"/>
               </w:rPr>
-              <w:t>4.20%</w:t>
+              <w:t>4.25%</w:t>
             </w:r>
           </w:p>
         </w:tc>
@@ -1482,7 +1482,7 @@
                 <w:b w:val="0"/>
                 <w:sz w:val="18"/>
               </w:rPr>
-              <w:t>6</w:t>
+              <w:t>5</w:t>
             </w:r>
           </w:p>
         </w:tc>
@@ -1501,7 +1501,7 @@
                 <w:b w:val="0"/>
                 <w:sz w:val="18"/>
               </w:rPr>
-              <w:t>3.8%</w:t>
+              <w:t>3.2%</w:t>
             </w:r>
           </w:p>
         </w:tc>
@@ -1520,7 +1520,7 @@
                 <w:b w:val="0"/>
                 <w:sz w:val="18"/>
               </w:rPr>
-              <w:t>0.29%</w:t>
+              <w:t>0.24%</w:t>
             </w:r>
           </w:p>
         </w:tc>
@@ -1874,7 +1874,7 @@
                 <w:b/>
                 <w:sz w:val="18"/>
               </w:rPr>
-              <w:t>41</w:t>
+              <w:t>40</w:t>
             </w:r>
           </w:p>
         </w:tc>
@@ -1893,7 +1893,7 @@
                 <w:b/>
                 <w:sz w:val="18"/>
               </w:rPr>
-              <w:t>26.3%</w:t>
+              <w:t>25.6%</w:t>
             </w:r>
           </w:p>
         </w:tc>
@@ -1912,7 +1912,7 @@
                 <w:b/>
                 <w:sz w:val="18"/>
               </w:rPr>
-              <w:t>1.98%</w:t>
+              <w:t>1.93%</w:t>
             </w:r>
           </w:p>
         </w:tc>
@@ -1971,7 +1971,7 @@
                 <w:b/>
                 <w:sz w:val="18"/>
               </w:rPr>
-              <w:t>115</w:t>
+              <w:t>116</w:t>
             </w:r>
           </w:p>
         </w:tc>
@@ -1990,7 +1990,7 @@
                 <w:b/>
                 <w:sz w:val="18"/>
               </w:rPr>
-              <w:t>73.7%</w:t>
+              <w:t>74.4%</w:t>
             </w:r>
           </w:p>
         </w:tc>
@@ -2009,7 +2009,7 @@
                 <w:b/>
                 <w:sz w:val="18"/>
               </w:rPr>
-              <w:t>5.55%</w:t>
+              <w:t>5.60%</w:t>
             </w:r>
           </w:p>
         </w:tc>
@@ -2056,7 +2056,7 @@
         <w:rPr>
           <w:b w:val="0"/>
         </w:rPr>
-        <w:t>Reading the twenty worst predictions, Persian compound spacing was so conspicuous that the working hypothesis became that it drove most of the measured error. Across all 200 utterances it accounts for 26.3% of events, which is real and worth reporting but not dominant. The twenty worst are where spacing errors concentrate, because splitting one word into two costs a full point on a four-word utterance, which is why the taxonomy is computed over all 200 rather than over the examples in section 5.</w:t>
+        <w:t>Reading the twenty worst predictions, Persian compound spacing was so conspicuous that the working hypothesis became that it drove most of the measured error. Across all 200 utterances it accounts for 25.6% of events, which is real and worth reporting but not dominant. The twenty worst are where spacing errors concentrate, because splitting one word into two costs a full point on a four-word utterance, which is why the taxonomy is computed over all 200 rather than over the examples in section 5.</w:t>
       </w:r>
     </w:p>
     <w:p>
@@ -2368,7 +2368,7 @@
         <w:rPr>
           <w:i w:val="0"/>
         </w:rPr>
-        <w:t>Separating the two needs a hand-built list of Persian register pairs, which would be a judgement call that happens to move the number favourably, so it was not made. Some part of the 73.7% is register variation rather than misrecognition.</w:t>
+        <w:t>Separating the two needs a hand-built list of Persian register pairs, which would be a judgement call that happens to move the number favourably, so it was not made. Some part of the 74.4% is register variation rather than misrecognition.</w:t>
       </w:r>
     </w:p>
     <w:p>
@@ -2831,7 +2831,7 @@
         </w:trPr>
         <w:tc>
           <w:tcPr>
-            <w:tcW w:type="dxa" w:w="3168"/>
+            <w:tcW w:type="dxa" w:w="3024"/>
             <w:shd w:val="clear" w:fill="DCE6F1"/>
           </w:tcPr>
           <w:p>
@@ -2849,7 +2849,7 @@
         </w:tc>
         <w:tc>
           <w:tcPr>
-            <w:tcW w:type="dxa" w:w="3168"/>
+            <w:tcW w:type="dxa" w:w="3024"/>
             <w:shd w:val="clear" w:fill="DCE6F1"/>
           </w:tcPr>
           <w:p>
@@ -2867,7 +2867,7 @@
         </w:tc>
         <w:tc>
           <w:tcPr>
-            <w:tcW w:type="dxa" w:w="3168"/>
+            <w:tcW w:type="dxa" w:w="3456"/>
             <w:shd w:val="clear" w:fill="DCE6F1"/>
           </w:tcPr>
           <w:p>
@@ -2886,7 +2886,7 @@
       <w:tr>
         <w:tc>
           <w:tcPr>
-            <w:tcW w:type="dxa" w:w="3168"/>
+            <w:tcW w:type="dxa" w:w="3024"/>
           </w:tcPr>
           <w:p>
             <w:pPr>
@@ -2898,13 +2898,13 @@
               <w:rPr>
                 <w:sz w:val="19"/>
               </w:rPr>
-              <w:t>غلامان</w:t>
+              <w:t>لهت</w:t>
             </w:r>
           </w:p>
         </w:tc>
         <w:tc>
           <w:tcPr>
-            <w:tcW w:type="dxa" w:w="3168"/>
+            <w:tcW w:type="dxa" w:w="3024"/>
           </w:tcPr>
           <w:p>
             <w:pPr>
@@ -2916,13 +2916,13 @@
               <w:rPr>
                 <w:sz w:val="19"/>
               </w:rPr>
-              <w:t>علامان</w:t>
+              <w:t>لحت</w:t>
             </w:r>
           </w:p>
         </w:tc>
         <w:tc>
           <w:tcPr>
-            <w:tcW w:type="dxa" w:w="3168"/>
+            <w:tcW w:type="dxa" w:w="3456"/>
           </w:tcPr>
           <w:p>
             <w:pPr>
@@ -2932,7 +2932,7 @@
               <w:rPr>
                 <w:sz w:val="17"/>
               </w:rPr>
-              <w:t>ghayn against ayn</w:t>
+              <w:t>he against he-jimi, both /h/</w:t>
             </w:r>
           </w:p>
         </w:tc>
@@ -2940,7 +2940,7 @@
       <w:tr>
         <w:tc>
           <w:tcPr>
-            <w:tcW w:type="dxa" w:w="3168"/>
+            <w:tcW w:type="dxa" w:w="3024"/>
           </w:tcPr>
           <w:p>
             <w:pPr>
@@ -2952,13 +2952,13 @@
               <w:rPr>
                 <w:sz w:val="19"/>
               </w:rPr>
-              <w:t>لهت</w:t>
+              <w:t>باضیا</w:t>
             </w:r>
           </w:p>
         </w:tc>
         <w:tc>
           <w:tcPr>
-            <w:tcW w:type="dxa" w:w="3168"/>
+            <w:tcW w:type="dxa" w:w="3024"/>
           </w:tcPr>
           <w:p>
             <w:pPr>
@@ -2970,13 +2970,13 @@
               <w:rPr>
                 <w:sz w:val="19"/>
               </w:rPr>
-              <w:t>لحت</w:t>
+              <w:t>بازیا</w:t>
             </w:r>
           </w:p>
         </w:tc>
         <w:tc>
           <w:tcPr>
-            <w:tcW w:type="dxa" w:w="3168"/>
+            <w:tcW w:type="dxa" w:w="3456"/>
           </w:tcPr>
           <w:p>
             <w:pPr>
@@ -2986,7 +2986,7 @@
               <w:rPr>
                 <w:sz w:val="17"/>
               </w:rPr>
-              <w:t>he against he-jimi</w:t>
+              <w:t>zad against ze, both /z/</w:t>
             </w:r>
           </w:p>
         </w:tc>
@@ -2994,7 +2994,7 @@
       <w:tr>
         <w:tc>
           <w:tcPr>
-            <w:tcW w:type="dxa" w:w="3168"/>
+            <w:tcW w:type="dxa" w:w="3024"/>
           </w:tcPr>
           <w:p>
             <w:pPr>
@@ -3006,13 +3006,13 @@
               <w:rPr>
                 <w:sz w:val="19"/>
               </w:rPr>
-              <w:t>باضیا</w:t>
+              <w:t>حیات</w:t>
             </w:r>
           </w:p>
         </w:tc>
         <w:tc>
           <w:tcPr>
-            <w:tcW w:type="dxa" w:w="3168"/>
+            <w:tcW w:type="dxa" w:w="3024"/>
           </w:tcPr>
           <w:p>
             <w:pPr>
@@ -3024,13 +3024,13 @@
               <w:rPr>
                 <w:sz w:val="19"/>
               </w:rPr>
-              <w:t>بازیا</w:t>
+              <w:t>حیاط</w:t>
             </w:r>
           </w:p>
         </w:tc>
         <w:tc>
           <w:tcPr>
-            <w:tcW w:type="dxa" w:w="3168"/>
+            <w:tcW w:type="dxa" w:w="3456"/>
           </w:tcPr>
           <w:p>
             <w:pPr>
@@ -3040,7 +3040,7 @@
               <w:rPr>
                 <w:sz w:val="17"/>
               </w:rPr>
-              <w:t>zad against ze</w:t>
+              <w:t>te against ta, both /t/</w:t>
             </w:r>
           </w:p>
         </w:tc>
@@ -3048,7 +3048,7 @@
       <w:tr>
         <w:tc>
           <w:tcPr>
-            <w:tcW w:type="dxa" w:w="3168"/>
+            <w:tcW w:type="dxa" w:w="3024"/>
           </w:tcPr>
           <w:p>
             <w:pPr>
@@ -3060,13 +3060,13 @@
               <w:rPr>
                 <w:sz w:val="19"/>
               </w:rPr>
-              <w:t>حیات</w:t>
+              <w:t>امریکا</w:t>
             </w:r>
           </w:p>
         </w:tc>
         <w:tc>
           <w:tcPr>
-            <w:tcW w:type="dxa" w:w="3168"/>
+            <w:tcW w:type="dxa" w:w="3024"/>
           </w:tcPr>
           <w:p>
             <w:pPr>
@@ -3078,13 +3078,13 @@
               <w:rPr>
                 <w:sz w:val="19"/>
               </w:rPr>
-              <w:t>حیاط</w:t>
+              <w:t>آمریکا</w:t>
             </w:r>
           </w:p>
         </w:tc>
         <w:tc>
           <w:tcPr>
-            <w:tcW w:type="dxa" w:w="3168"/>
+            <w:tcW w:type="dxa" w:w="3456"/>
           </w:tcPr>
           <w:p>
             <w:pPr>
@@ -3094,7 +3094,7 @@
               <w:rPr>
                 <w:sz w:val="17"/>
               </w:rPr>
-              <w:t>te against ta</w:t>
+              <w:t>alef against alef-madde</w:t>
             </w:r>
           </w:p>
         </w:tc>
@@ -3110,7 +3110,29 @@
         <w:rPr>
           <w:i w:val="0"/>
         </w:rPr>
-        <w:t>Persian inherited these letters from Arabic and merged their pronunciation. The two letters in each pair above are the same sound in modern Persian, as are the four ways of writing z and the three ways of writing s. No acoustic model can choose between them because there is nothing in the waveform to choose from; only lexical memory resolves it, and only for words seen often enough. All six instances in this sample are low-frequency words. This category has a floor that more audio cannot lower.</w:t>
+        <w:t>Persian inherited these letters from Arabic and merged their pronunciation. The two letters in each pair are the same sound in modern Persian, as are all four ways of writing z and all three ways of writing s. Nothing in the waveform distinguishes them, so the choice cannot come from the audio; it has to come from having seen the word written.</w:t>
+      </w:r>
+    </w:p>
+    <w:p>
+      <w:r>
+        <w:rPr>
+          <w:i w:val="0"/>
+        </w:rPr>
+        <w:t>That last point sets the limit precisely, and it is narrower than it first appears. The acoustic signal will never carry the distinction, but the spelling is learnable per word from text, so more training data does reduce this category — for the words that data covers. What it cannot fix is a word the model has never seen, where there is no basis for the choice at all. All five instances here are low-frequency words, which is consistent with that reading. The floor applies to unseen vocabulary, not to the phenomenon as a whole.</w:t>
+      </w:r>
+    </w:p>
+    <w:p>
+      <w:r>
+        <w:rPr>
+          <w:b/>
+        </w:rPr>
+        <w:t xml:space="preserve">One correction worth recording. </w:t>
+      </w:r>
+      <w:r>
+        <w:rPr>
+          <w:b w:val="0"/>
+        </w:rPr>
+        <w:t>غ and ع were originally grouped here as well, which was wrong. In Persian غ is a velar fricative merged with ق, while ع is a glottal stop usually not realised at all, so غلامان and علامان do not sound alike. A model confusing them has misrecognised the audio rather than chosen a spelling. Removing that pair moved one event from the orthographic column into substitution, which is why the totals are 40 and 116 rather than 41 and 115.</w:t>
       </w:r>
     </w:p>
     <w:p>
@@ -4517,7 +4539,7 @@
               <w:rPr>
                 <w:sz w:val="15"/>
               </w:rPr>
-              <w:t>split ×3, homophone غ→ع, preposition ×2</w:t>
+              <w:t>split ×3, substitution, preposition ×2</w:t>
             </w:r>
           </w:p>
         </w:tc>
@@ -6279,6 +6301,22 @@
       </w:pPr>
       <w:r>
         <w:t>7. If you had one more week to improve this model, what would you try first, and why?</w:t>
+      </w:r>
+    </w:p>
+    <w:p>
+      <w:r>
+        <w:rPr>
+          <w:i w:val="0"/>
+        </w:rPr>
+        <w:t>1.  First of all, I would evaluate the model on transcripts it has not come across during training, because in this evaluation about 51% of the transcripts it was evaluated on had their text present during training and the model had already seen them. No audio was shared between the training and validation splits; the overlap is in the text only. So I would evaluate the model on data it was not trained on, so that a more realistic number is shown.</w:t>
+      </w:r>
+    </w:p>
+    <w:p>
+      <w:r>
+        <w:rPr>
+          <w:i w:val="0"/>
+        </w:rPr>
+        <w:t>2.  After that, the thing I would improve is this: since around 22% of the errors are for things like spacing and the half-space (ZWNJ), I would first decide on a single standard and change the dataset according to that standard, so that the model trains on a dataset that has been standardised and has one consistent structure.</w:t>
       </w:r>
     </w:p>
     <w:sectPr>

</xml_diff>